<commit_message>
Docs: dropbox intake (DESIGN §8), Entra + file connectors, LH_ naming + single-source note
</commit_message>
<xml_diff>
--- a/control_plane/docs/DESIGN.docx
+++ b/control_plane/docs/DESIGN.docx
@@ -260,11 +260,9 @@
         <w:br/>
         <w:t xml:space="preserve">    connectors/                #   ONE FILE PER SOURCE — auto-registered</w:t>
         <w:br/>
-        <w:t xml:space="preserve">      __init__.py              #     registry + @ingest_connector + resolve/run_connector</w:t>
+        <w:t xml:space="preserve">      __init__.py  base.py     #     registry + @ingest_connector + resolve/run_connector; shared helpers</w:t>
         <w:br/>
-        <w:t xml:space="preserve">      base.py                  #     shared: connection resolution, jdbc dialects/loader, apply_select</w:t>
-        <w:br/>
-        <w:t xml:space="preserve">      jdbc.py odbc.py http.py oracle.py db2.py staged.py</w:t>
+        <w:t xml:space="preserve">      jdbc.py odbc.py http.py oracle.py db2.py staged.py entra.py file.py</w:t>
         <w:br/>
         <w:t xml:space="preserve">    discovery/                 #   ONE FILE PER DISCOVERER — auto-registered</w:t>
         <w:br/>
@@ -276,13 +274,13 @@
         <w:br/>
         <w:t xml:space="preserve">    workers/                   #   entrypoints called by the thin notebooks</w:t>
         <w:br/>
-        <w:t xml:space="preserve">      __init__.py  plan.py  bronze.py  silver.py  metadata.py  gold.py</w:t>
+        <w:t xml:space="preserve">      __init__.py  plan.py  bronze.py  silver.py  metadata.py  gold.py  dropbox.py</w:t>
         <w:br/>
         <w:t xml:space="preserve">  notebooks/</w:t>
         <w:br/>
         <w:t xml:space="preserve">    cp_framework.py            # GENERATED by cp_bundle.py — do not edit</w:t>
         <w:br/>
-        <w:t xml:space="preserve">    bronze_worker.py silver_worker.py metadata_worker.py cp_plan.py gold_runner.py   # 3-cell shells</w:t>
+        <w:t xml:space="preserve">    bronze_worker/silver_worker/metadata_worker/cp_plan/gold_runner/dropbox_worker.py  # 3-cell shells</w:t>
         <w:br/>
         <w:t xml:space="preserve">    sq_*.py                    # gold source-query notebooks (per gold object; use gold_write)</w:t>
         <w:br/>
@@ -290,7 +288,9 @@
         <w:br/>
         <w:t xml:space="preserve">    cp_bundle.py               # package -&gt; cp_framework cell (validates public API + registries)</w:t>
         <w:br/>
-        <w:t xml:space="preserve">    cp_deploy.py cp_config.py cp_sqldb.py ...   # deploy tooling (already modular)</w:t>
+        <w:t xml:space="preserve">    cp_folders.py              # workspace folder placement (notebook/ +utility/sourcequery, pipeline/)</w:t>
+        <w:br/>
+        <w:t xml:space="preserve">    cp_deploy.py cp_config.py cp_sqldb.py cp_security.py ...   # deploy tooling (already modular)</w:t>
         <w:br/>
         <w:t xml:space="preserve">  tests/                       # off-cluster pytest (pure modules + bundle validity)</w:t>
         <w:br/>
@@ -302,15 +302,184 @@
         <w:rPr>
           <w:b/>
         </w:rPr>
-        <w:t>Dependency direction</w:t>
-      </w:r>
-      <w:r>
-        <w:t xml:space="preserve"> (no cycles): `runtime → naming/dag → storage/secrets/config_db →</w:t>
+        <w:t>Lakehouses</w:t>
+      </w:r>
+      <w:r>
+        <w:t xml:space="preserve"> (resolved by name from </w:t>
+      </w:r>
+      <w:r>
+        <w:rPr>
+          <w:rFonts w:ascii="Consolas" w:hAnsi="Consolas"/>
+          <w:color w:val="A31F34"/>
+        </w:rPr>
+        <w:t>cp_vars</w:t>
+      </w:r>
+      <w:r>
+        <w:t xml:space="preserve">): </w:t>
+      </w:r>
+      <w:r>
+        <w:rPr>
+          <w:rFonts w:ascii="Consolas" w:hAnsi="Consolas"/>
+          <w:color w:val="A31F34"/>
+        </w:rPr>
+        <w:t>LH_metadata</w:t>
+      </w:r>
+      <w:r>
+        <w:t xml:space="preserve"> (control/audit/ledger), </w:t>
+      </w:r>
+      <w:r>
+        <w:rPr>
+          <w:rFonts w:ascii="Consolas" w:hAnsi="Consolas"/>
+          <w:color w:val="A31F34"/>
+        </w:rPr>
+        <w:t>LH_bronze</w:t>
+      </w:r>
+      <w:r>
+        <w:t>,</w:t>
       </w:r>
     </w:p>
     <w:p>
       <w:r>
+        <w:rPr>
+          <w:rFonts w:ascii="Consolas" w:hAnsi="Consolas"/>
+          <w:color w:val="A31F34"/>
+        </w:rPr>
+        <w:t>LH_silver</w:t>
+      </w:r>
+      <w:r>
+        <w:t xml:space="preserve">, </w:t>
+      </w:r>
+      <w:r>
+        <w:rPr>
+          <w:rFonts w:ascii="Consolas" w:hAnsi="Consolas"/>
+          <w:color w:val="A31F34"/>
+        </w:rPr>
+        <w:t>LH_gold</w:t>
+      </w:r>
+      <w:r>
+        <w:t xml:space="preserve"> (medallion), and </w:t>
+      </w:r>
+      <w:r>
+        <w:rPr>
+          <w:rFonts w:ascii="Consolas" w:hAnsi="Consolas"/>
+          <w:color w:val="A31F34"/>
+        </w:rPr>
+        <w:t>LH_Filedrop</w:t>
+      </w:r>
+      <w:r>
+        <w:t xml:space="preserve"> (dropbox landing — see §8).</w:t>
+      </w:r>
+    </w:p>
+    <w:p>
+      <w:r>
+        <w:rPr>
+          <w:b/>
+        </w:rPr>
+        <w:t>Dependency direction</w:t>
+      </w:r>
+      <w:r>
+        <w:t xml:space="preserve"> (no cycles): `runtime → naming/dag → storage/secrets/config_db →</w:t>
+      </w:r>
+    </w:p>
+    <w:p>
+      <w:r>
         <w:t>transform/audit → cleanse/connectors/discovery → gold → workers`.</w:t>
+      </w:r>
+    </w:p>
+    <w:p>
+      <w:r>
+        <w:rPr>
+          <w:b/>
+        </w:rPr>
+        <w:t>Built-in connectors:</w:t>
+      </w:r>
+      <w:r>
+        <w:t xml:space="preserve"> </w:t>
+      </w:r>
+      <w:r>
+        <w:rPr>
+          <w:rFonts w:ascii="Consolas" w:hAnsi="Consolas"/>
+          <w:color w:val="A31F34"/>
+        </w:rPr>
+        <w:t>jdbc</w:t>
+      </w:r>
+      <w:r>
+        <w:t xml:space="preserve"> (sqlserver/postgresql/mysql), </w:t>
+      </w:r>
+      <w:r>
+        <w:rPr>
+          <w:rFonts w:ascii="Consolas" w:hAnsi="Consolas"/>
+          <w:color w:val="A31F34"/>
+        </w:rPr>
+        <w:t>oracle</w:t>
+      </w:r>
+      <w:r>
+        <w:t xml:space="preserve">, </w:t>
+      </w:r>
+      <w:r>
+        <w:rPr>
+          <w:rFonts w:ascii="Consolas" w:hAnsi="Consolas"/>
+          <w:color w:val="A31F34"/>
+        </w:rPr>
+        <w:t>db2</w:t>
+      </w:r>
+      <w:r>
+        <w:t xml:space="preserve">, </w:t>
+      </w:r>
+      <w:r>
+        <w:rPr>
+          <w:rFonts w:ascii="Consolas" w:hAnsi="Consolas"/>
+          <w:color w:val="A31F34"/>
+        </w:rPr>
+        <w:t>odbc</w:t>
+      </w:r>
+      <w:r>
+        <w:t xml:space="preserve">, </w:t>
+      </w:r>
+      <w:r>
+        <w:rPr>
+          <w:rFonts w:ascii="Consolas" w:hAnsi="Consolas"/>
+          <w:color w:val="A31F34"/>
+        </w:rPr>
+        <w:t>http</w:t>
+      </w:r>
+    </w:p>
+    <w:p>
+      <w:r>
+        <w:t xml:space="preserve">(any REST/CSV/zip-CSV API), </w:t>
+      </w:r>
+      <w:r>
+        <w:rPr>
+          <w:rFonts w:ascii="Consolas" w:hAnsi="Consolas"/>
+          <w:color w:val="A31F34"/>
+        </w:rPr>
+        <w:t>staged</w:t>
+      </w:r>
+      <w:r>
+        <w:t xml:space="preserve"> (on-prem via gateway), </w:t>
+      </w:r>
+      <w:r>
+        <w:rPr>
+          <w:b/>
+        </w:rPr>
+        <w:t>`entra`</w:t>
+      </w:r>
+      <w:r>
+        <w:t xml:space="preserve"> (Microsoft Graph —</w:t>
+      </w:r>
+    </w:p>
+    <w:p>
+      <w:r>
+        <w:t xml:space="preserve">client-credentials, paginated directory objects), </w:t>
+      </w:r>
+      <w:r>
+        <w:rPr>
+          <w:b/>
+        </w:rPr>
+        <w:t>`file`</w:t>
+      </w:r>
+      <w:r>
+        <w:t xml:space="preserve"> (dropbox csv/txt/xlsx/xls).</w:t>
       </w:r>
     </w:p>
     <w:p>
@@ -935,13 +1104,16 @@
           <w:rFonts w:ascii="Consolas" w:hAnsi="Consolas"/>
           <w:color w:val="A31F34"/>
         </w:rPr>
-        <w:t>workers = SimpleNamespace(plan, bronze, silver, metadata, gold)</w:t>
-      </w:r>
-      <w:r>
-        <w:t>; the wheel exposes the same via</w:t>
+        <w:t>workers = SimpleNamespace(plan, bronze, silver, metadata, gold, dropbox)</w:t>
+      </w:r>
+      <w:r>
+        <w:t>; the wheel exposes the</w:t>
       </w:r>
     </w:p>
     <w:p>
+      <w:r>
+        <w:t xml:space="preserve">same via </w:t>
+      </w:r>
       <w:r>
         <w:rPr>
           <w:rFonts w:ascii="Consolas" w:hAnsi="Consolas"/>
@@ -960,12 +1132,12 @@
         <w:t>**kw</w:t>
       </w:r>
       <w:r>
-        <w:t>, so the pipeline</w:t>
+        <w:t>, so the</w:t>
       </w:r>
     </w:p>
     <w:p>
       <w:r>
-        <w:t xml:space="preserve">can pass any subset (e.g. </w:t>
+        <w:t xml:space="preserve">pipeline can pass any subset (e.g. </w:t>
       </w:r>
       <w:r>
         <w:rPr>
@@ -1383,6 +1555,80 @@
           </w:p>
         </w:tc>
       </w:tr>
+      <w:tr>
+        <w:tc>
+          <w:tcPr>
+            <w:tcW w:type="dxa" w:w="2880"/>
+          </w:tcPr>
+          <w:p>
+            <w:r>
+              <w:rPr>
+                <w:sz w:val="18"/>
+              </w:rPr>
+            </w:r>
+            <w:r>
+              <w:rPr>
+                <w:rFonts w:ascii="Consolas" w:hAnsi="Consolas"/>
+                <w:color w:val="A31F34"/>
+                <w:sz w:val="18"/>
+              </w:rPr>
+              <w:t>dropbox_worker</w:t>
+            </w:r>
+          </w:p>
+        </w:tc>
+        <w:tc>
+          <w:tcPr>
+            <w:tcW w:type="dxa" w:w="2880"/>
+          </w:tcPr>
+          <w:p>
+            <w:r>
+              <w:rPr>
+                <w:sz w:val="18"/>
+              </w:rPr>
+            </w:r>
+            <w:r>
+              <w:rPr>
+                <w:rFonts w:ascii="Consolas" w:hAnsi="Consolas"/>
+                <w:color w:val="A31F34"/>
+                <w:sz w:val="18"/>
+              </w:rPr>
+              <w:t>workers.dropbox(run_id, file_path)</w:t>
+            </w:r>
+          </w:p>
+        </w:tc>
+        <w:tc>
+          <w:tcPr>
+            <w:tcW w:type="dxa" w:w="2880"/>
+          </w:tcPr>
+          <w:p>
+            <w:r>
+              <w:rPr>
+                <w:sz w:val="18"/>
+              </w:rPr>
+            </w:r>
+            <w:r>
+              <w:rPr>
+                <w:sz w:val="18"/>
+              </w:rPr>
+              <w:t xml:space="preserve">register + load ONE dropped file (or scan all of </w:t>
+            </w:r>
+            <w:r>
+              <w:rPr>
+                <w:rFonts w:ascii="Consolas" w:hAnsi="Consolas"/>
+                <w:color w:val="A31F34"/>
+                <w:sz w:val="18"/>
+              </w:rPr>
+              <w:t>newfile/</w:t>
+            </w:r>
+            <w:r>
+              <w:rPr>
+                <w:sz w:val="18"/>
+              </w:rPr>
+              <w:t>) — see §8</w:t>
+            </w:r>
+          </w:p>
+        </w:tc>
+      </w:tr>
     </w:tbl>
     <w:p/>
     <w:p>
@@ -1760,6 +2006,134 @@
       </w:r>
     </w:p>
     <w:p>
+      <w:r>
+        <w:t xml:space="preserve">Lakehouse </w:t>
+      </w:r>
+      <w:r>
+        <w:rPr>
+          <w:b/>
+        </w:rPr>
+        <w:t>names</w:t>
+      </w:r>
+      <w:r>
+        <w:t xml:space="preserve"> live in exactly one place — the </w:t>
+      </w:r>
+      <w:r>
+        <w:rPr>
+          <w:rFonts w:ascii="Consolas" w:hAnsi="Consolas"/>
+          <w:color w:val="A31F34"/>
+        </w:rPr>
+        <w:t>cp_vars</w:t>
+      </w:r>
+      <w:r>
+        <w:t xml:space="preserve"> </w:t>
+      </w:r>
+      <w:r>
+        <w:rPr>
+          <w:rFonts w:ascii="Consolas" w:hAnsi="Consolas"/>
+          <w:color w:val="A31F34"/>
+        </w:rPr>
+        <w:t>*_lakehouse</w:t>
+      </w:r>
+      <w:r>
+        <w:t xml:space="preserve"> variables. The runtime</w:t>
+      </w:r>
+    </w:p>
+    <w:p>
+      <w:r>
+        <w:t>and *all* deploy tooling (</w:t>
+      </w:r>
+      <w:r>
+        <w:rPr>
+          <w:rFonts w:ascii="Consolas" w:hAnsi="Consolas"/>
+          <w:color w:val="A31F34"/>
+        </w:rPr>
+        <w:t>cp_common</w:t>
+      </w:r>
+      <w:r>
+        <w:t xml:space="preserve">, </w:t>
+      </w:r>
+      <w:r>
+        <w:rPr>
+          <w:rFonts w:ascii="Consolas" w:hAnsi="Consolas"/>
+          <w:color w:val="A31F34"/>
+        </w:rPr>
+        <w:t>cp_pipeline</w:t>
+      </w:r>
+      <w:r>
+        <w:t xml:space="preserve"> Copy sinks, </w:t>
+      </w:r>
+      <w:r>
+        <w:rPr>
+          <w:rFonts w:ascii="Consolas" w:hAnsi="Consolas"/>
+          <w:color w:val="A31F34"/>
+        </w:rPr>
+        <w:t>cp_security</w:t>
+      </w:r>
+      <w:r>
+        <w:t>) resolve logical</w:t>
+      </w:r>
+    </w:p>
+    <w:p>
+      <w:r>
+        <w:t>layers (</w:t>
+      </w:r>
+      <w:r>
+        <w:rPr>
+          <w:rFonts w:ascii="Consolas" w:hAnsi="Consolas"/>
+          <w:color w:val="A31F34"/>
+        </w:rPr>
+        <w:t>bronze</w:t>
+      </w:r>
+      <w:r>
+        <w:t>/</w:t>
+      </w:r>
+      <w:r>
+        <w:rPr>
+          <w:rFonts w:ascii="Consolas" w:hAnsi="Consolas"/>
+          <w:color w:val="A31F34"/>
+        </w:rPr>
+        <w:t>silver</w:t>
+      </w:r>
+      <w:r>
+        <w:t>/…) → physical names (</w:t>
+      </w:r>
+      <w:r>
+        <w:rPr>
+          <w:rFonts w:ascii="Consolas" w:hAnsi="Consolas"/>
+          <w:color w:val="A31F34"/>
+        </w:rPr>
+        <w:t>LH_bronze</w:t>
+      </w:r>
+      <w:r>
+        <w:t>/…) through it (</w:t>
+      </w:r>
+      <w:r>
+        <w:rPr>
+          <w:rFonts w:ascii="Consolas" w:hAnsi="Consolas"/>
+          <w:color w:val="A31F34"/>
+        </w:rPr>
+        <w:t>cp_manifest.LAKEHOUSE_NAMES</w:t>
+      </w:r>
+      <w:r>
+        <w:t>),</w:t>
+      </w:r>
+    </w:p>
+    <w:p>
+      <w:r>
+        <w:t xml:space="preserve">so </w:t>
+      </w:r>
+      <w:r>
+        <w:rPr>
+          <w:b/>
+        </w:rPr>
+        <w:t>renaming a lakehouse is a one-line `variables.json` edit</w:t>
+      </w:r>
+      <w:r>
+        <w:t xml:space="preserve"> with no code changes anywhere.</w:t>
+      </w:r>
+    </w:p>
+    <w:p>
       <w:pPr>
         <w:pStyle w:val="Heading2"/>
       </w:pPr>
@@ -1874,7 +2248,536 @@
       </w:pPr>
       <w:r/>
       <w:r>
-        <w:t>8. Design principles</w:t>
+        <w:t>8. Event-driven file intake (dropbox)</w:t>
+      </w:r>
+    </w:p>
+    <w:p>
+      <w:r>
+        <w:t>Ad-hoc files (voice-of-customer surveys, one-off spreadsheets) land in a dedicated lakehouse and</w:t>
+      </w:r>
+    </w:p>
+    <w:p>
+      <w:r>
+        <w:t>flow into the same medallion — no config authoring, no code. It reuses the whole engine; the only</w:t>
+      </w:r>
+    </w:p>
+    <w:p>
+      <w:r>
+        <w:t xml:space="preserve">new parts are the </w:t>
+      </w:r>
+      <w:r>
+        <w:rPr>
+          <w:rFonts w:ascii="Consolas" w:hAnsi="Consolas"/>
+          <w:color w:val="A31F34"/>
+        </w:rPr>
+        <w:t>file</w:t>
+      </w:r>
+      <w:r>
+        <w:t xml:space="preserve"> connector, </w:t>
+      </w:r>
+      <w:r>
+        <w:rPr>
+          <w:rFonts w:ascii="Consolas" w:hAnsi="Consolas"/>
+          <w:color w:val="A31F34"/>
+        </w:rPr>
+        <w:t>workers.dropbox</w:t>
+      </w:r>
+      <w:r>
+        <w:t xml:space="preserve">, and the </w:t>
+      </w:r>
+      <w:r>
+        <w:rPr>
+          <w:rFonts w:ascii="Consolas" w:hAnsi="Consolas"/>
+          <w:color w:val="A31F34"/>
+        </w:rPr>
+        <w:t>cp_pl_dropbox</w:t>
+      </w:r>
+      <w:r>
+        <w:t xml:space="preserve"> pipeline + trigger.</w:t>
+      </w:r>
+    </w:p>
+    <w:p>
+      <w:r>
+        <w:rPr>
+          <w:b/>
+        </w:rPr>
+        <w:t>Landing layout</w:t>
+      </w:r>
+      <w:r>
+        <w:t xml:space="preserve"> — lakehouse </w:t>
+      </w:r>
+      <w:r>
+        <w:rPr>
+          <w:b/>
+        </w:rPr>
+        <w:t>`LH_Filedrop`</w:t>
+      </w:r>
+      <w:r>
+        <w:t>:</w:t>
+      </w:r>
+    </w:p>
+    <w:p>
+      <w:pPr>
+        <w:ind w:left="240"/>
+      </w:pPr>
+      <w:r>
+        <w:rPr>
+          <w:rFonts w:ascii="Consolas" w:hAnsi="Consolas"/>
+          <w:sz w:val="17"/>
+        </w:rPr>
+        <w:t>Files/newfile/&lt;schema&gt;/&lt;file&gt;     users drop here; subfolder = medallion schema (root file -&gt; dbo)</w:t>
+        <w:br/>
+        <w:t>Files/archive/YYYY/MM/DD/&lt;file&gt;   processed files are moved here (grouped by day, not per run)</w:t>
+      </w:r>
+    </w:p>
+    <w:p>
+      <w:r>
+        <w:rPr>
+          <w:b/>
+        </w:rPr>
+        <w:t>Flow</w:t>
+      </w:r>
+      <w:r>
+        <w:t xml:space="preserve"> — a </w:t>
+      </w:r>
+      <w:r>
+        <w:rPr>
+          <w:b/>
+        </w:rPr>
+        <w:t>OneLake event trigger</w:t>
+      </w:r>
+      <w:r>
+        <w:t xml:space="preserve"> on </w:t>
+      </w:r>
+      <w:r>
+        <w:rPr>
+          <w:rFonts w:ascii="Consolas" w:hAnsi="Consolas"/>
+          <w:color w:val="A31F34"/>
+        </w:rPr>
+        <w:t>newfile/**</w:t>
+      </w:r>
+      <w:r>
+        <w:t xml:space="preserve"> fires </w:t>
+      </w:r>
+      <w:r>
+        <w:rPr>
+          <w:b/>
+        </w:rPr>
+        <w:t>one pipeline run per file created</w:t>
+      </w:r>
+      <w:r>
+        <w:t>,</w:t>
+      </w:r>
+    </w:p>
+    <w:p>
+      <w:r>
+        <w:t xml:space="preserve">passing the file's path as the CloudEvent </w:t>
+      </w:r>
+      <w:r>
+        <w:rPr>
+          <w:rFonts w:ascii="Consolas" w:hAnsi="Consolas"/>
+          <w:color w:val="A31F34"/>
+        </w:rPr>
+        <w:t>Subject</w:t>
+      </w:r>
+      <w:r>
+        <w:t xml:space="preserve">. </w:t>
+      </w:r>
+      <w:r>
+        <w:rPr>
+          <w:rFonts w:ascii="Consolas" w:hAnsi="Consolas"/>
+          <w:color w:val="A31F34"/>
+        </w:rPr>
+        <w:t>cp_pl_dropbox</w:t>
+      </w:r>
+      <w:r>
+        <w:t xml:space="preserve"> → the thin </w:t>
+      </w:r>
+      <w:r>
+        <w:rPr>
+          <w:rFonts w:ascii="Consolas" w:hAnsi="Consolas"/>
+          <w:color w:val="A31F34"/>
+        </w:rPr>
+        <w:t>dropbox_worker</w:t>
+      </w:r>
+      <w:r>
+        <w:t xml:space="preserve"> →</w:t>
+      </w:r>
+    </w:p>
+    <w:p>
+      <w:r>
+        <w:rPr>
+          <w:rFonts w:ascii="Consolas" w:hAnsi="Consolas"/>
+          <w:color w:val="A31F34"/>
+        </w:rPr>
+        <w:t>workers.dropbox(file_path)</w:t>
+      </w:r>
+      <w:r>
+        <w:t>:</w:t>
+      </w:r>
+    </w:p>
+    <w:p>
+      <w:r>
+        <w:t xml:space="preserve">1. Parse path → schema (subfolder or </w:t>
+      </w:r>
+      <w:r>
+        <w:rPr>
+          <w:rFonts w:ascii="Consolas" w:hAnsi="Consolas"/>
+          <w:color w:val="A31F34"/>
+        </w:rPr>
+        <w:t>dbo</w:t>
+      </w:r>
+      <w:r>
+        <w:t>), filename, extension; hash the bytes.</w:t>
+      </w:r>
+    </w:p>
+    <w:p>
+      <w:r>
+        <w:t xml:space="preserve">2. </w:t>
+      </w:r>
+      <w:r>
+        <w:rPr>
+          <w:b/>
+        </w:rPr>
+        <w:t>Ledger check</w:t>
+      </w:r>
+      <w:r>
+        <w:t xml:space="preserve"> — skip if this </w:t>
+      </w:r>
+      <w:r>
+        <w:rPr>
+          <w:rFonts w:ascii="Consolas" w:hAnsi="Consolas"/>
+          <w:color w:val="A31F34"/>
+        </w:rPr>
+        <w:t>(schema/file, content-hash)</w:t>
+      </w:r>
+      <w:r>
+        <w:t xml:space="preserve"> is already in </w:t>
+      </w:r>
+      <w:r>
+        <w:rPr>
+          <w:rFonts w:ascii="Consolas" w:hAnsi="Consolas"/>
+          <w:color w:val="A31F34"/>
+        </w:rPr>
+        <w:t>dropbox_ledger</w:t>
+      </w:r>
+      <w:r>
+        <w:t>.</w:t>
+      </w:r>
+    </w:p>
+    <w:p>
+      <w:r>
+        <w:t xml:space="preserve">3. </w:t>
+      </w:r>
+      <w:r>
+        <w:rPr>
+          <w:b/>
+        </w:rPr>
+        <w:t>Register</w:t>
+      </w:r>
+      <w:r>
+        <w:t xml:space="preserve"> (idempotent) a </w:t>
+      </w:r>
+      <w:r>
+        <w:rPr>
+          <w:rFonts w:ascii="Consolas" w:hAnsi="Consolas"/>
+          <w:color w:val="A31F34"/>
+        </w:rPr>
+        <w:t>file</w:t>
+      </w:r>
+      <w:r>
+        <w:t xml:space="preserve"> datasource for the schema + one </w:t>
+      </w:r>
+      <w:r>
+        <w:rPr>
+          <w:rFonts w:ascii="Consolas" w:hAnsi="Consolas"/>
+          <w:color w:val="A31F34"/>
+        </w:rPr>
+        <w:t>source_object</w:t>
+      </w:r>
+      <w:r>
+        <w:t xml:space="preserve"> per file, and</w:t>
+      </w:r>
+    </w:p>
+    <w:p>
+      <w:r>
+        <w:t xml:space="preserve">   </w:t>
+      </w:r>
+      <w:r>
+        <w:rPr>
+          <w:b/>
+        </w:rPr>
+        <w:t>per Excel sheet</w:t>
+      </w:r>
+      <w:r>
+        <w:t xml:space="preserve"> (</w:t>
+      </w:r>
+      <w:r>
+        <w:rPr>
+          <w:rFonts w:ascii="Consolas" w:hAnsi="Consolas"/>
+          <w:color w:val="A31F34"/>
+        </w:rPr>
+        <w:t>.xlsx</w:t>
+      </w:r>
+      <w:r>
+        <w:t>/</w:t>
+      </w:r>
+      <w:r>
+        <w:rPr>
+          <w:rFonts w:ascii="Consolas" w:hAnsi="Consolas"/>
+          <w:color w:val="A31F34"/>
+        </w:rPr>
+        <w:t>.xls</w:t>
+      </w:r>
+      <w:r>
+        <w:t xml:space="preserve"> → </w:t>
+      </w:r>
+      <w:r>
+        <w:rPr>
+          <w:rFonts w:ascii="Consolas" w:hAnsi="Consolas"/>
+          <w:color w:val="A31F34"/>
+        </w:rPr>
+        <w:t>&lt;file&gt;_&lt;tab&gt;</w:t>
+      </w:r>
+      <w:r>
+        <w:t>; csv/txt → one table). Landing name is clean</w:t>
+      </w:r>
+    </w:p>
+    <w:p>
+      <w:r>
+        <w:t xml:space="preserve">   (</w:t>
+      </w:r>
+      <w:r>
+        <w:rPr>
+          <w:rFonts w:ascii="Consolas" w:hAnsi="Consolas"/>
+          <w:color w:val="A31F34"/>
+        </w:rPr>
+        <w:t>&lt;schema&gt;.&lt;file[_tab]&gt;</w:t>
+      </w:r>
+      <w:r>
+        <w:t xml:space="preserve">, no </w:t>
+      </w:r>
+      <w:r>
+        <w:rPr>
+          <w:rFonts w:ascii="Consolas" w:hAnsi="Consolas"/>
+          <w:color w:val="A31F34"/>
+        </w:rPr>
+        <w:t>dbo_</w:t>
+      </w:r>
+      <w:r>
+        <w:t xml:space="preserve"> prefix) via a </w:t>
+      </w:r>
+      <w:r>
+        <w:rPr>
+          <w:rFonts w:ascii="Consolas" w:hAnsi="Consolas"/>
+          <w:color w:val="A31F34"/>
+        </w:rPr>
+        <w:t>landed</w:t>
+      </w:r>
+      <w:r>
+        <w:t xml:space="preserve"> override in </w:t>
+      </w:r>
+      <w:r>
+        <w:rPr>
+          <w:rFonts w:ascii="Consolas" w:hAnsi="Consolas"/>
+          <w:color w:val="A31F34"/>
+        </w:rPr>
+        <w:t>source_options_json</w:t>
+      </w:r>
+      <w:r>
+        <w:t>.</w:t>
+      </w:r>
+    </w:p>
+    <w:p>
+      <w:r>
+        <w:t xml:space="preserve">4. </w:t>
+      </w:r>
+      <w:r>
+        <w:rPr>
+          <w:b/>
+        </w:rPr>
+        <w:t>Bronze APPEND</w:t>
+      </w:r>
+      <w:r>
+        <w:t xml:space="preserve"> (raw history of every drop) → </w:t>
+      </w:r>
+      <w:r>
+        <w:rPr>
+          <w:b/>
+        </w:rPr>
+        <w:t>silver dedup on the full row hash</w:t>
+      </w:r>
+    </w:p>
+    <w:p>
+      <w:r>
+        <w:t xml:space="preserve">   (</w:t>
+      </w:r>
+      <w:r>
+        <w:rPr>
+          <w:rFonts w:ascii="Consolas" w:hAnsi="Consolas"/>
+          <w:color w:val="A31F34"/>
+        </w:rPr>
+        <w:t>key_columns_json = ["_row_hash"]</w:t>
+      </w:r>
+      <w:r>
+        <w:t>), so re-dropping identical content is idempotent and an</w:t>
+      </w:r>
+    </w:p>
+    <w:p>
+      <w:r>
+        <w:t xml:space="preserve">   updated file contributes only its new/changed rows. Files are read </w:t>
+      </w:r>
+      <w:r>
+        <w:rPr>
+          <w:b/>
+        </w:rPr>
+        <w:t>as strings</w:t>
+      </w:r>
+      <w:r>
+        <w:t xml:space="preserve"> so the row</w:t>
+      </w:r>
+    </w:p>
+    <w:p>
+      <w:r>
+        <w:t xml:space="preserve">   hash is stable across drops.</w:t>
+      </w:r>
+    </w:p>
+    <w:p>
+      <w:r>
+        <w:t xml:space="preserve">5. </w:t>
+      </w:r>
+      <w:r>
+        <w:rPr>
+          <w:b/>
+        </w:rPr>
+        <w:t>Archive</w:t>
+      </w:r>
+      <w:r>
+        <w:t xml:space="preserve"> the file to </w:t>
+      </w:r>
+      <w:r>
+        <w:rPr>
+          <w:rFonts w:ascii="Consolas" w:hAnsi="Consolas"/>
+          <w:color w:val="A31F34"/>
+        </w:rPr>
+        <w:t>archive/YYYY/MM/DD/</w:t>
+      </w:r>
+      <w:r>
+        <w:t xml:space="preserve"> and write the ledger row.</w:t>
+      </w:r>
+    </w:p>
+    <w:p>
+      <w:r>
+        <w:rPr>
+          <w:b/>
+        </w:rPr>
+        <w:t>Idempotency &amp; concurrency</w:t>
+      </w:r>
+      <w:r>
+        <w:t xml:space="preserve"> — three layers make it safe under the per-file event model (a batch</w:t>
+      </w:r>
+    </w:p>
+    <w:p>
+      <w:r>
+        <w:t xml:space="preserve">of *N* files = *N* concurrent runs): the </w:t>
+      </w:r>
+      <w:r>
+        <w:rPr>
+          <w:b/>
+        </w:rPr>
+        <w:t>hash ledger</w:t>
+      </w:r>
+      <w:r>
+        <w:t xml:space="preserve"> skips duplicate events, the **row-hash</w:t>
+      </w:r>
+    </w:p>
+    <w:p>
+      <w:r>
+        <w:t>dedup</w:t>
+      </w:r>
+      <w:r>
+        <w:rPr>
+          <w:b/>
+        </w:rPr>
+        <w:t xml:space="preserve"> means even a duplicate that slips through adds no rows, and </w:t>
+      </w:r>
+      <w:r>
+        <w:rPr>
+          <w:rFonts w:ascii="Consolas" w:hAnsi="Consolas"/>
+          <w:color w:val="A31F34"/>
+        </w:rPr>
+        <w:t>seed_control_tables</w:t>
+      </w:r>
+      <w:r>
+        <w:t xml:space="preserve"> is</w:t>
+      </w:r>
+    </w:p>
+    <w:p>
+      <w:r>
+        <w:t>concurrency-safe** (tolerates the Delta "empty directory" create race on a fresh lakehouse). With</w:t>
+      </w:r>
+    </w:p>
+    <w:p>
+      <w:r>
+        <w:t xml:space="preserve">no </w:t>
+      </w:r>
+      <w:r>
+        <w:rPr>
+          <w:rFonts w:ascii="Consolas" w:hAnsi="Consolas"/>
+          <w:color w:val="A31F34"/>
+        </w:rPr>
+        <w:t>file_path</w:t>
+      </w:r>
+      <w:r>
+        <w:t xml:space="preserve">, </w:t>
+      </w:r>
+      <w:r>
+        <w:rPr>
+          <w:rFonts w:ascii="Consolas" w:hAnsi="Consolas"/>
+          <w:color w:val="A31F34"/>
+        </w:rPr>
+        <w:t>workers.dropbox</w:t>
+      </w:r>
+      <w:r>
+        <w:t xml:space="preserve"> </w:t>
+      </w:r>
+      <w:r>
+        <w:rPr>
+          <w:b/>
+        </w:rPr>
+        <w:t>scans</w:t>
+      </w:r>
+      <w:r>
+        <w:t xml:space="preserve"> all of </w:t>
+      </w:r>
+      <w:r>
+        <w:rPr>
+          <w:rFonts w:ascii="Consolas" w:hAnsi="Consolas"/>
+          <w:color w:val="A31F34"/>
+        </w:rPr>
+        <w:t>newfile/</w:t>
+      </w:r>
+      <w:r>
+        <w:t xml:space="preserve"> — the manual/scheduled batch path.</w:t>
+      </w:r>
+    </w:p>
+    <w:p>
+      <w:r>
+        <w:t>&gt; Event triggers are inherently *per file* (Fabric emits one event per created file and can't</w:t>
+      </w:r>
+    </w:p>
+    <w:p>
+      <w:r>
+        <w:t>&gt; coalesce them). For a single run that batches everything, schedule the scan instead.</w:t>
+      </w:r>
+    </w:p>
+    <w:p>
+      <w:pPr>
+        <w:pStyle w:val="Heading2"/>
+      </w:pPr>
+      <w:r/>
+      <w:r>
+        <w:t>9. Design principles</w:t>
       </w:r>
     </w:p>
     <w:p>

</xml_diff>

<commit_message>
DESIGN: document the modular gold operator (strategy per type) + stage-only SQ notebooks
</commit_message>
<xml_diff>
--- a/control_plane/docs/DESIGN.docx
+++ b/control_plane/docs/DESIGN.docx
@@ -256,7 +256,11 @@
         <w:br/>
         <w:t xml:space="preserve">    audit.py                   #   run/object logging, watermarks, seed_control_tables, SCHEMAS</w:t>
         <w:br/>
-        <w:t xml:space="preserve">    gold.py                    #   gold_write, scd2 merge, build_stage_and_gold</w:t>
+        <w:t xml:space="preserve">    gold/                      #   GOLD TABLE OPERATOR — one strategy file per type — auto-registered</w:t>
+        <w:br/>
+        <w:t xml:space="preserve">      __init__.py              #     registry + @gold_strategy + gold_merge(stage,type,table,keys,run_id)</w:t>
+        <w:br/>
+        <w:t xml:space="preserve">      scd1.py  scd2.py  fact.py</w:t>
         <w:br/>
         <w:t xml:space="preserve">    connectors/                #   ONE FILE PER SOURCE — auto-registered</w:t>
         <w:br/>
@@ -1015,6 +1019,86 @@
                 <w:sz w:val="18"/>
               </w:rPr>
               <w:t>(df, cols, params) -&gt; df</w:t>
+            </w:r>
+          </w:p>
+        </w:tc>
+      </w:tr>
+      <w:tr>
+        <w:tc>
+          <w:tcPr>
+            <w:tcW w:type="dxa" w:w="2160"/>
+          </w:tcPr>
+          <w:p>
+            <w:r>
+              <w:rPr>
+                <w:sz w:val="18"/>
+              </w:rPr>
+            </w:r>
+            <w:r>
+              <w:rPr>
+                <w:sz w:val="18"/>
+              </w:rPr>
+              <w:t>Gold strategy</w:t>
+            </w:r>
+          </w:p>
+        </w:tc>
+        <w:tc>
+          <w:tcPr>
+            <w:tcW w:type="dxa" w:w="2160"/>
+          </w:tcPr>
+          <w:p>
+            <w:r>
+              <w:rPr>
+                <w:sz w:val="18"/>
+              </w:rPr>
+            </w:r>
+            <w:r>
+              <w:rPr>
+                <w:rFonts w:ascii="Consolas" w:hAnsi="Consolas"/>
+                <w:color w:val="A31F34"/>
+                <w:sz w:val="18"/>
+              </w:rPr>
+              <w:t>gold/*.py</w:t>
+            </w:r>
+          </w:p>
+        </w:tc>
+        <w:tc>
+          <w:tcPr>
+            <w:tcW w:type="dxa" w:w="2160"/>
+          </w:tcPr>
+          <w:p>
+            <w:r>
+              <w:rPr>
+                <w:sz w:val="18"/>
+              </w:rPr>
+            </w:r>
+            <w:r>
+              <w:rPr>
+                <w:rFonts w:ascii="Consolas" w:hAnsi="Consolas"/>
+                <w:color w:val="A31F34"/>
+                <w:sz w:val="18"/>
+              </w:rPr>
+              <w:t>@gold_strategy("type")</w:t>
+            </w:r>
+          </w:p>
+        </w:tc>
+        <w:tc>
+          <w:tcPr>
+            <w:tcW w:type="dxa" w:w="2160"/>
+          </w:tcPr>
+          <w:p>
+            <w:r>
+              <w:rPr>
+                <w:sz w:val="18"/>
+              </w:rPr>
+            </w:r>
+            <w:r>
+              <w:rPr>
+                <w:rFonts w:ascii="Consolas" w:hAnsi="Consolas"/>
+                <w:color w:val="A31F34"/>
+                <w:sz w:val="18"/>
+              </w:rPr>
+              <w:t>(gold_path, stage_df, keys) -&gt; None</w:t>
             </w:r>
           </w:p>
         </w:tc>
@@ -1536,21 +1620,7 @@
               <w:rPr>
                 <w:sz w:val="18"/>
               </w:rPr>
-              <w:t xml:space="preserve">run the model's </w:t>
-            </w:r>
-            <w:r>
-              <w:rPr>
-                <w:rFonts w:ascii="Consolas" w:hAnsi="Consolas"/>
-                <w:color w:val="A31F34"/>
-                <w:sz w:val="18"/>
-              </w:rPr>
-              <w:t>sq_*</w:t>
-            </w:r>
-            <w:r>
-              <w:rPr>
-                <w:sz w:val="18"/>
-              </w:rPr>
-              <w:t xml:space="preserve"> notebooks in topo order</w:t>
+              <w:t>per gold object (topo order): run its SQ notebook → read the stage → apply the type's strategy</w:t>
             </w:r>
           </w:p>
         </w:tc>
@@ -1631,6 +1701,147 @@
       </w:tr>
     </w:tbl>
     <w:p/>
+    <w:p>
+      <w:r>
+        <w:rPr>
+          <w:b/>
+        </w:rPr>
+        <w:t>Gold build — stage then strategy.</w:t>
+      </w:r>
+      <w:r>
+        <w:t xml:space="preserve"> A model's gold tables build in dependency order. For each</w:t>
+      </w:r>
+    </w:p>
+    <w:p>
+      <w:r>
+        <w:rPr>
+          <w:rFonts w:ascii="Consolas" w:hAnsi="Consolas"/>
+          <w:color w:val="A31F34"/>
+        </w:rPr>
+        <w:t>gold_object</w:t>
+      </w:r>
+      <w:r>
+        <w:t xml:space="preserve">, the runner runs its </w:t>
+      </w:r>
+      <w:r>
+        <w:rPr>
+          <w:b/>
+        </w:rPr>
+        <w:t>source-query notebook</w:t>
+      </w:r>
+      <w:r>
+        <w:t xml:space="preserve"> — a *framework-free* SparkSQL/PySpark</w:t>
+      </w:r>
+    </w:p>
+    <w:p>
+      <w:r>
+        <w:t xml:space="preserve">transform that reads silver and writes a </w:t>
+      </w:r>
+      <w:r>
+        <w:rPr>
+          <w:b/>
+        </w:rPr>
+        <w:t>stage</w:t>
+      </w:r>
+      <w:r>
+        <w:t xml:space="preserve"> table (`CREATE OR REPLACE TABLE stage.&lt;t&gt; AS</w:t>
+      </w:r>
+    </w:p>
+    <w:p>
+      <w:r>
+        <w:t>SELECT …</w:t>
+      </w:r>
+      <w:r>
+        <w:rPr>
+          <w:rFonts w:ascii="Consolas" w:hAnsi="Consolas"/>
+          <w:color w:val="A31F34"/>
+        </w:rPr>
+        <w:t xml:space="preserve">) — then reads that stage and applies the **strategy** for the object's </w:t>
+      </w:r>
+      <w:r>
+        <w:t>gold_type`</w:t>
+      </w:r>
+    </w:p>
+    <w:p>
+      <w:r>
+        <w:t xml:space="preserve">(scd1/scd2/fact) to merge it into gold. The merge lives in </w:t>
+      </w:r>
+      <w:r>
+        <w:rPr>
+          <w:rFonts w:ascii="Consolas" w:hAnsi="Consolas"/>
+          <w:color w:val="A31F34"/>
+        </w:rPr>
+        <w:t>cp/gold/</w:t>
+      </w:r>
+      <w:r>
+        <w:t>, never in the notebook, so</w:t>
+      </w:r>
+    </w:p>
+    <w:p>
+      <w:r>
+        <w:t xml:space="preserve">SQ notebooks stay pure transforms. Deploy attaches </w:t>
+      </w:r>
+      <w:r>
+        <w:rPr>
+          <w:rFonts w:ascii="Consolas" w:hAnsi="Consolas"/>
+          <w:color w:val="A31F34"/>
+        </w:rPr>
+        <w:t>LH_silver</w:t>
+      </w:r>
+      <w:r>
+        <w:t>+</w:t>
+      </w:r>
+      <w:r>
+        <w:rPr>
+          <w:rFonts w:ascii="Consolas" w:hAnsi="Consolas"/>
+          <w:color w:val="A31F34"/>
+        </w:rPr>
+        <w:t>LH_gold</w:t>
+      </w:r>
+      <w:r>
+        <w:t xml:space="preserve"> to the SQ notebooks (and</w:t>
+      </w:r>
+    </w:p>
+    <w:p>
+      <w:r>
+        <w:t xml:space="preserve">to </w:t>
+      </w:r>
+      <w:r>
+        <w:rPr>
+          <w:rFonts w:ascii="Consolas" w:hAnsi="Consolas"/>
+          <w:color w:val="A31F34"/>
+        </w:rPr>
+        <w:t>gold_runner</w:t>
+      </w:r>
+      <w:r>
+        <w:t xml:space="preserve">, since </w:t>
+      </w:r>
+      <w:r>
+        <w:rPr>
+          <w:rFonts w:ascii="Consolas" w:hAnsi="Consolas"/>
+          <w:color w:val="A31F34"/>
+        </w:rPr>
+        <w:t>notebook.run</w:t>
+      </w:r>
+      <w:r>
+        <w:t xml:space="preserve"> executes the child in the parent's lakehouse context); the</w:t>
+      </w:r>
+    </w:p>
+    <w:p>
+      <w:r>
+        <w:t xml:space="preserve">silver name is injected from </w:t>
+      </w:r>
+      <w:r>
+        <w:rPr>
+          <w:rFonts w:ascii="Consolas" w:hAnsi="Consolas"/>
+          <w:color w:val="A31F34"/>
+        </w:rPr>
+        <w:t>cp_vars</w:t>
+      </w:r>
+      <w:r>
+        <w:t>, so it's rename-safe.</w:t>
+      </w:r>
+    </w:p>
     <w:p>
       <w:pPr>
         <w:pStyle w:val="Heading2"/>

</xml_diff>

<commit_message>
docs: document column_map dictionary + collision handling (WORKING_GUIDE, DESIGN)
WORKING_GUIDE §5: add column_map (+ dropbox_ledger) to the control-tables reference and a note on
how it's populated (file connector for file headers incl. ':' '-'; silver for source->snake renames;
only changed columns) and collision de-dup (unique_names -> _2/_3, both columns survive, originals
recoverable). DESIGN: add unique_names/column_map to the module list and a note in the dropbox
section. Regenerated docx.
</commit_message>
<xml_diff>
--- a/control_plane/docs/DESIGN.docx
+++ b/control_plane/docs/DESIGN.docx
@@ -242,7 +242,7 @@
         <w:br/>
         <w:t xml:space="preserve">    runtime.py                 #   spark, notebookutils, cp_vars, lakehouse GUIDs, WS id, config-DB id, tpath</w:t>
         <w:br/>
-        <w:t xml:space="preserve">    naming.py                  #   snake, _norm_ident, now_ts, landed_table          (pure — unit-tested)</w:t>
+        <w:t xml:space="preserve">    naming.py                  #   snake, _norm_ident, unique_names, now_ts, landed_table  (pure — unit-tested)</w:t>
         <w:br/>
         <w:t xml:space="preserve">    dag.py                     #   topo_levels                                        (pure — unit-tested)</w:t>
         <w:br/>
@@ -254,7 +254,7 @@
         <w:br/>
         <w:t xml:space="preserve">    transform.py               #   business_cols, row_hash, merge_upsert</w:t>
         <w:br/>
-        <w:t xml:space="preserve">    audit.py                   #   run/object logging, watermarks, seed_control_tables, SCHEMAS</w:t>
+        <w:t xml:space="preserve">    audit.py                   #   run/object logging, watermarks, seed_control_tables, SCHEMAS, column_map</w:t>
         <w:br/>
         <w:t xml:space="preserve">    gold/                      #   GOLD TABLE OPERATOR — one strategy file per type — auto-registered</w:t>
         <w:br/>
@@ -3129,6 +3129,220 @@
       </w:r>
     </w:p>
     <w:p>
+      <w:r>
+        <w:rPr>
+          <w:b/>
+        </w:rPr>
+        <w:t>Original column names (`column_map`) &amp; collisions.</w:t>
+      </w:r>
+      <w:r>
+        <w:t xml:space="preserve"> Column names are sanitized to be Delta-safe</w:t>
+      </w:r>
+    </w:p>
+    <w:p>
+      <w:r>
+        <w:t xml:space="preserve">(file headers lose </w:t>
+      </w:r>
+      <w:r>
+        <w:rPr>
+          <w:rFonts w:ascii="Consolas" w:hAnsi="Consolas"/>
+          <w:color w:val="A31F34"/>
+        </w:rPr>
+        <w:t>:</w:t>
+      </w:r>
+      <w:r>
+        <w:t xml:space="preserve"> </w:t>
+      </w:r>
+      <w:r>
+        <w:rPr>
+          <w:rFonts w:ascii="Consolas" w:hAnsi="Consolas"/>
+          <w:color w:val="A31F34"/>
+        </w:rPr>
+        <w:t>-</w:t>
+      </w:r>
+      <w:r>
+        <w:t xml:space="preserve"> spaces; silver snake-cases all), but the original header can be a *business</w:t>
+      </w:r>
+    </w:p>
+    <w:p>
+      <w:r>
+        <w:t xml:space="preserve">value* you later </w:t>
+      </w:r>
+      <w:r>
+        <w:rPr>
+          <w:b/>
+        </w:rPr>
+        <w:t>unpivot</w:t>
+      </w:r>
+      <w:r>
+        <w:t xml:space="preserve"> into a row. The framework records the original in the global </w:t>
+      </w:r>
+      <w:r>
+        <w:rPr>
+          <w:b/>
+        </w:rPr>
+        <w:t>`column_map`</w:t>
+      </w:r>
+    </w:p>
+    <w:p>
+      <w:r>
+        <w:t xml:space="preserve">table for every column whose landed name changed (only changed columns — stored via </w:t>
+      </w:r>
+      <w:r>
+        <w:rPr>
+          <w:rFonts w:ascii="Consolas" w:hAnsi="Consolas"/>
+          <w:color w:val="A31F34"/>
+        </w:rPr>
+        <w:t>record_column_map</w:t>
+      </w:r>
+      <w:r>
+        <w:t>).</w:t>
+      </w:r>
+    </w:p>
+    <w:p>
+      <w:r>
+        <w:t xml:space="preserve">The </w:t>
+      </w:r>
+      <w:r>
+        <w:rPr>
+          <w:b/>
+        </w:rPr>
+        <w:t>`file` connector</w:t>
+      </w:r>
+      <w:r>
+        <w:t xml:space="preserve"> records file headers (incl. </w:t>
+      </w:r>
+      <w:r>
+        <w:rPr>
+          <w:rFonts w:ascii="Consolas" w:hAnsi="Consolas"/>
+          <w:color w:val="A31F34"/>
+        </w:rPr>
+        <w:t>:</w:t>
+      </w:r>
+      <w:r>
+        <w:t xml:space="preserve"> </w:t>
+      </w:r>
+      <w:r>
+        <w:rPr>
+          <w:rFonts w:ascii="Consolas" w:hAnsi="Consolas"/>
+          <w:color w:val="A31F34"/>
+        </w:rPr>
+        <w:t>-</w:t>
+      </w:r>
+      <w:r>
+        <w:t xml:space="preserve">); the </w:t>
+      </w:r>
+      <w:r>
+        <w:rPr>
+          <w:b/>
+        </w:rPr>
+        <w:t>silver worker</w:t>
+      </w:r>
+      <w:r>
+        <w:t xml:space="preserve"> records `source →</w:t>
+      </w:r>
+    </w:p>
+    <w:p>
+      <w:r>
+        <w:t>snake</w:t>
+      </w:r>
+      <w:r>
+        <w:rPr>
+          <w:rFonts w:ascii="Consolas" w:hAnsi="Consolas"/>
+          <w:color w:val="A31F34"/>
+        </w:rPr>
+        <w:t xml:space="preserve"> renames for non-file sources; a gold </w:t>
+      </w:r>
+      <w:r>
+        <w:t>sq_*` notebook restores the true header on unpivot. If two</w:t>
+      </w:r>
+    </w:p>
+    <w:p>
+      <w:r>
+        <w:t>headers reduce to the same physical name (</w:t>
+      </w:r>
+      <w:r>
+        <w:rPr>
+          <w:rFonts w:ascii="Consolas" w:hAnsi="Consolas"/>
+          <w:color w:val="A31F34"/>
+        </w:rPr>
+        <w:t>A2:2</w:t>
+      </w:r>
+      <w:r>
+        <w:t xml:space="preserve"> + </w:t>
+      </w:r>
+      <w:r>
+        <w:rPr>
+          <w:rFonts w:ascii="Consolas" w:hAnsi="Consolas"/>
+          <w:color w:val="A31F34"/>
+        </w:rPr>
+        <w:t>A2-2</w:t>
+      </w:r>
+      <w:r>
+        <w:t xml:space="preserve"> → </w:t>
+      </w:r>
+      <w:r>
+        <w:rPr>
+          <w:rFonts w:ascii="Consolas" w:hAnsi="Consolas"/>
+          <w:color w:val="A31F34"/>
+        </w:rPr>
+        <w:t>a2_2</w:t>
+      </w:r>
+      <w:r>
+        <w:t xml:space="preserve">), </w:t>
+      </w:r>
+      <w:r>
+        <w:rPr>
+          <w:rFonts w:ascii="Consolas" w:hAnsi="Consolas"/>
+          <w:color w:val="A31F34"/>
+        </w:rPr>
+        <w:t>naming.unique_names</w:t>
+      </w:r>
+      <w:r>
+        <w:t xml:space="preserve"> de-duplicates</w:t>
+      </w:r>
+    </w:p>
+    <w:p>
+      <w:r>
+        <w:t>deterministically (</w:t>
+      </w:r>
+      <w:r>
+        <w:rPr>
+          <w:rFonts w:ascii="Consolas" w:hAnsi="Consolas"/>
+          <w:color w:val="A31F34"/>
+        </w:rPr>
+        <w:t>a2_2</w:t>
+      </w:r>
+      <w:r>
+        <w:t xml:space="preserve">, </w:t>
+      </w:r>
+      <w:r>
+        <w:rPr>
+          <w:rFonts w:ascii="Consolas" w:hAnsi="Consolas"/>
+          <w:color w:val="A31F34"/>
+        </w:rPr>
+        <w:t>a2_2_2</w:t>
+      </w:r>
+      <w:r>
+        <w:t>) — so both columns survive (Delta rejects duplicates) and each</w:t>
+      </w:r>
+    </w:p>
+    <w:p>
+      <w:r>
+        <w:t xml:space="preserve">original is recoverable. See </w:t>
+      </w:r>
+      <w:r>
+        <w:rPr>
+          <w:rFonts w:ascii="Consolas" w:hAnsi="Consolas"/>
+          <w:color w:val="A31F34"/>
+        </w:rPr>
+        <w:t>WORKING_GUIDE.md</w:t>
+      </w:r>
+      <w:r>
+        <w:t xml:space="preserve"> §5.</w:t>
+      </w:r>
+    </w:p>
+    <w:p>
       <w:pPr>
         <w:pStyle w:val="Heading2"/>
       </w:pPr>

</xml_diff>